<commit_message>
Expand and audit copyright design documentation
</commit_message>
<xml_diff>
--- a/docs/registration/word/01_用户操作说明书.docx
+++ b/docs/registration/word/01_用户操作说明书.docx
@@ -4,94 +4,37 @@
   <w:body>
     <w:p>
       <w:pPr>
-        <w:spacing w:before="1400"/>
+        <w:keepNext/>
+        <w:spacing w:after="160"/>
       </w:pPr>
       <w:r>
         <w:rPr>
           <w:rFonts w:ascii="Arial" w:hAnsi="Arial" w:eastAsia="Noto Sans CJK SC"/>
           <w:b/>
-          <w:color w:val="176B60"/>
-          <w:sz w:val="24"/>
+          <w:color w:val="173F3C"/>
+          <w:sz w:val="32"/>
         </w:rPr>
-        <w:t>MEDLABEL REVIEW</w:t>
+        <w:t>药品说明书版本比对与变更审核系统 V1.0</w:t>
       </w:r>
     </w:p>
     <w:p>
       <w:pPr>
-        <w:pStyle w:val="Title"/>
-        <w:spacing w:after="280"/>
+        <w:keepNext/>
+        <w:spacing w:after="180"/>
       </w:pPr>
-      <w:r>
-        <w:t>药品说明书版本比对与变更审核系统</w:t>
-      </w:r>
-    </w:p>
-    <w:p>
-      <w:pPr>
-        <w:spacing w:after="680"/>
-      </w:pPr>
-      <w:r>
-        <w:rPr>
-          <w:rFonts w:ascii="Arial" w:hAnsi="Arial" w:eastAsia="Noto Sans CJK SC"/>
-          <w:b w:val="0"/>
-          <w:color w:val="173F3C"/>
-          <w:sz w:val="44"/>
-        </w:rPr>
-        <w:t>V1.0</w:t>
-      </w:r>
-    </w:p>
-    <w:p>
       <w:r>
         <w:rPr>
           <w:rFonts w:ascii="Arial" w:hAnsi="Arial" w:eastAsia="Noto Sans CJK SC"/>
           <w:b/>
           <w:color w:val="173F3C"/>
-          <w:sz w:val="38"/>
+          <w:sz w:val="30"/>
         </w:rPr>
         <w:t>用户操作说明书</w:t>
       </w:r>
     </w:p>
     <w:p>
       <w:pPr>
-        <w:spacing w:before="240"/>
-      </w:pPr>
-      <w:r>
-        <w:rPr>
-          <w:rFonts w:ascii="Arial" w:hAnsi="Arial" w:eastAsia="Noto Sans CJK SC"/>
-          <w:b w:val="0"/>
-          <w:sz w:val="22"/>
-        </w:rPr>
-        <w:t>著作权人：待申请人填写</w:t>
-      </w:r>
-    </w:p>
-    <w:p>
-      <w:pPr>
-        <w:spacing w:before="240"/>
-      </w:pPr>
-      <w:r>
-        <w:rPr>
-          <w:rFonts w:ascii="Arial" w:hAnsi="Arial" w:eastAsia="Noto Sans CJK SC"/>
-          <w:b w:val="0"/>
-          <w:sz w:val="22"/>
-        </w:rPr>
-        <w:t>对应代码版本：98e406f</w:t>
-      </w:r>
-    </w:p>
-    <w:p>
-      <w:pPr>
-        <w:spacing w:before="240"/>
-      </w:pPr>
-      <w:r>
-        <w:rPr>
-          <w:rFonts w:ascii="Arial" w:hAnsi="Arial" w:eastAsia="Noto Sans CJK SC"/>
-          <w:b w:val="0"/>
-          <w:sz w:val="22"/>
-        </w:rPr>
-        <w:t>文档状态：技术内容已编制，申请信息待确认</w:t>
-      </w:r>
-    </w:p>
-    <w:p>
-      <w:pPr>
-        <w:spacing w:before="720"/>
+        <w:spacing w:after="100"/>
       </w:pPr>
       <w:r>
         <w:rPr>
@@ -100,121 +43,21 @@
           <w:color w:val="526763"/>
           <w:sz w:val="18"/>
         </w:rPr>
-        <w:t>本文所示药品、说明书及审核记录均为软件演示资料。</w:t>
-      </w:r>
-    </w:p>
-    <w:p>
-      <w:r>
-        <w:br w:type="page"/>
+        <w:t>著作权人：待申请人填写</w:t>
       </w:r>
     </w:p>
     <w:p>
       <w:pPr>
-        <w:pStyle w:val="Heading1"/>
+        <w:spacing w:after="100"/>
       </w:pPr>
       <w:r>
-        <w:t>内容索引</w:t>
-      </w:r>
-    </w:p>
-    <w:p>
-      <w:pPr>
-        <w:spacing w:after="140"/>
-      </w:pPr>
-      <w:r>
-        <w:t>1 软件概述</w:t>
-      </w:r>
-    </w:p>
-    <w:p>
-      <w:pPr>
-        <w:spacing w:after="140"/>
-      </w:pPr>
-      <w:r>
-        <w:t>2 安装与启动</w:t>
-      </w:r>
-    </w:p>
-    <w:p>
-      <w:pPr>
-        <w:spacing w:after="140"/>
-      </w:pPr>
-      <w:r>
-        <w:t>3 工作台与业务流程</w:t>
-      </w:r>
-    </w:p>
-    <w:p>
-      <w:pPr>
-        <w:spacing w:after="140"/>
-      </w:pPr>
-      <w:r>
-        <w:t>4 药品档案管理</w:t>
-      </w:r>
-    </w:p>
-    <w:p>
-      <w:pPr>
-        <w:spacing w:after="140"/>
-      </w:pPr>
-      <w:r>
-        <w:t>5 导入和查看说明书版本</w:t>
-      </w:r>
-    </w:p>
-    <w:p>
-      <w:pPr>
-        <w:spacing w:after="140"/>
-      </w:pPr>
-      <w:r>
-        <w:t>6 检查和校正章节</w:t>
-      </w:r>
-    </w:p>
-    <w:p>
-      <w:pPr>
-        <w:spacing w:after="140"/>
-      </w:pPr>
-      <w:r>
-        <w:t>7 创建和阅读版本比对</w:t>
-      </w:r>
-    </w:p>
-    <w:p>
-      <w:pPr>
-        <w:spacing w:after="140"/>
-      </w:pPr>
-      <w:r>
-        <w:t>8 人工审核变更</w:t>
-      </w:r>
-    </w:p>
-    <w:p>
-      <w:pPr>
-        <w:spacing w:after="140"/>
-      </w:pPr>
-      <w:r>
-        <w:t>9 导出与归档</w:t>
-      </w:r>
-    </w:p>
-    <w:p>
-      <w:pPr>
-        <w:spacing w:after="140"/>
-      </w:pPr>
-      <w:r>
-        <w:t>10 操作记录与数据保存</w:t>
-      </w:r>
-    </w:p>
-    <w:p>
-      <w:pPr>
-        <w:spacing w:after="140"/>
-      </w:pPr>
-      <w:r>
-        <w:t>11 常见问题处理</w:t>
-      </w:r>
-    </w:p>
-    <w:p>
-      <w:pPr>
-        <w:spacing w:after="140"/>
-      </w:pPr>
-      <w:r>
-        <w:t>12 示例操作与完成检查</w:t>
-      </w:r>
-    </w:p>
-    <w:p>
-      <w:r>
-        <w:br w:type="page"/>
+        <w:rPr>
+          <w:rFonts w:ascii="Arial" w:hAnsi="Arial" w:eastAsia="Noto Sans CJK SC"/>
+          <w:b w:val="0"/>
+          <w:color w:val="526763"/>
+          <w:sz w:val="18"/>
+        </w:rPr>
+        <w:t>对应代码版本：98e406f；文档状态：技术内容已编制，申请信息待确认</w:t>
       </w:r>
     </w:p>
     <w:tbl>
@@ -1402,7 +1245,7 @@
           <w:b w:val="0"/>
           <w:sz w:val="21"/>
         </w:rPr>
-        <w:t>首次使用可点击侧栏“体验模拟示例”。系统建立模拟药品的两个版本及一个比对任务，并打开变更审核页面。示例文字用于演示数字、单位、条款及章节变化，不是实际药品说明书，不得用于临床。</w:t>
+        <w:t>首次使用可点击侧栏“体验模拟示例”。系统建立模拟药品的两个版本及一个比对任务，并打开变更审核页面。示例文字用于演示数字、条款及章节增删变化，不是实际药品说明书，不得用于临床。默认示例的单位保持不变，不能将它作为单位变化识别的演示结果。</w:t>
       </w:r>
     </w:p>
     <w:p>
@@ -1921,6 +1764,16 @@
           <w:sz w:val="21"/>
         </w:rPr>
         <w:t>版本名称用于区分资料，可采用“初始版”“某年修订版”等可理解名称。版本日期应反映该份资料的实际版本信息，不应为满足比对条件随意更改。资料来源可填写发布机构、公告网址、文件编号或提供方，界面要求填写该项，报告会保留其内容。</w:t>
+      </w:r>
+    </w:p>
+    <w:p>
+      <w:r>
+        <w:rPr>
+          <w:rFonts w:ascii="Arial" w:hAnsi="Arial" w:eastAsia="Noto Sans CJK SC"/>
+          <w:b w:val="0"/>
+          <w:sz w:val="21"/>
+        </w:rPr>
+        <w:t>V1.0 未提供版本名称、日期、来源的编辑或删除入口。发现这些信息录错时，应使用正确信息重新导入一个版本，并核对后续比对任务所选版本；章节校正只调整章节标题和正文，不会修改上述版本资料。</w:t>
       </w:r>
     </w:p>
     <w:p>
@@ -3207,6 +3060,16 @@
       </w:r>
     </w:p>
     <w:p>
+      <w:r>
+        <w:rPr>
+          <w:rFonts w:ascii="Arial" w:hAnsi="Arial" w:eastAsia="Noto Sans CJK SC"/>
+          <w:b w:val="0"/>
+          <w:sz w:val="21"/>
+        </w:rPr>
+        <w:t>比较时会折叠连续空白，并去掉相邻汉字之间的空白，因此部分排版空白差异不生成变更。数字之间的分隔、标点、单位和否定词仍影响比较结果。若未检出变化，任务会显示已完成、待复核数为 0；这是没有待处理差异的计算结果，不表示已经完成一次独立的人工核查。</w:t>
+      </w:r>
+    </w:p>
+    <w:p>
       <w:pPr>
         <w:pStyle w:val="Heading1"/>
       </w:pPr>
@@ -3323,7 +3186,7 @@
           <w:b w:val="0"/>
           <w:sz w:val="21"/>
         </w:rPr>
-        <w:t>如果在多个浏览器标签页打开同一任务，其他页面保存后，旧页面再次提交可能出现冲突提示。此时先保留尚需使用的意见，刷新获得最新记录，再决定是否更新。系统通过记录修订号拒绝过期提交，避免旧内容覆盖新结论。</w:t>
+        <w:t>如果在多个浏览器标签页打开同一任务，其他页面保存后，旧页面再次提交可能出现冲突提示。界面会自动重新读取最新记录，并保留当前页面内尚未提交的意见供核对；这次冲突提交没有保存成功。请比较最新状态与草稿意见，再决定是否重新保存。如果还要手动刷新整个浏览器页面，应先另外保存草稿，以免页面内未提交内容丢失。系统通过记录修订号拒绝过期提交，避免旧内容覆盖新结论。</w:t>
       </w:r>
     </w:p>
     <w:p>
@@ -4435,6 +4298,16 @@
           <w:b w:val="0"/>
           <w:sz w:val="21"/>
         </w:rPr>
+        <w:t>使用未修改的内置示例时，两版各识别出 11 个章节。比对结果应为 6 个一致章节、6 条变化，其中 4 条修改、1 条新增、1 条删除；5 条为重点复核、1 条为常规复核。重点复核来自章节与数字规则，包括修订日期的数字变化，不是医学风险判断。新建任务的 6 条变化均为待复核；确认一条并忽略另一条后，剩余 4 条待复核。重复打开此前已审核的演示任务，状态可能不同，应与新建任务区分。</w:t>
+      </w:r>
+    </w:p>
+    <w:p>
+      <w:r>
+        <w:rPr>
+          <w:rFonts w:ascii="Arial" w:hAnsi="Arial" w:eastAsia="Noto Sans CJK SC"/>
+          <w:b w:val="0"/>
+          <w:sz w:val="21"/>
+        </w:rPr>
         <w:t>在审核页面选择一项变化，填写“已对照模拟原文，确认演示变更”并确认；选择另一项变化，填写清楚的演示忽略原因并忽略。切换状态筛选，核对条目和审核完成度。导出 HTML 报告，在浏览器查看两版来源与意见，再进入“操作记录”确认操作已留存。</w:t>
       </w:r>
     </w:p>

</xml_diff>